<commit_message>
modificacion pagina de login
</commit_message>
<xml_diff>
--- a/Guia_Preparacion_Previa_Solicitud_Redes.docx
+++ b/Guia_Preparacion_Previa_Solicitud_Redes.docx
@@ -427,11 +427,11 @@
         <w:rPr>
           <w:b/>
           <w:bCs/>
-          <w:color w:val="B45309"/>
+          <w:color w:val="1E8E5A"/>
           <w:sz w:val="18"/>
           <w:szCs w:val="18"/>
         </w:rPr>
-        <w:t xml:space="preserve">   ◻ PENDIENTE</w:t>
+        <w:t xml:space="preserve">   ✔ COMPLETADO</w:t>
       </w:r>
     </w:p>
     <w:p>
@@ -454,6 +454,18 @@
           <w:szCs w:val="21"/>
         </w:rPr>
         <w:t xml:space="preserve">es el dato que Redes necesita para crear los registros DNS — conseguirlo de antemano evita una ida y vuelta con ese equipo.</w:t>
+      </w:r>
+    </w:p>
+    <w:p>
+      <w:pPr>
+        <w:spacing w:after="140" w:line="300"/>
+      </w:pPr>
+      <w:r>
+        <w:rPr>
+          <w:sz w:val="21"/>
+          <w:szCs w:val="21"/>
+        </w:rPr>
+        <w:t xml:space="preserve">Bitácora de lo realizado (7 de agosto de 2026):</w:t>
       </w:r>
     </w:p>
     <w:p>
@@ -470,7 +482,7 @@
           <w:sz w:val="21"/>
           <w:szCs w:val="21"/>
         </w:rPr>
-        <w:t xml:space="preserve">Desde un dispositivo conectado a la red de la oficina (no por VPN), entrar a un sitio como whatismyip.com o ifconfig.me.</w:t>
+        <w:t xml:space="preserve">Se consultó whatismyip.com desde un dispositivo conectado a la red de la oficina.</w:t>
       </w:r>
     </w:p>
     <w:p>
@@ -487,7 +499,7 @@
           <w:sz w:val="21"/>
           <w:szCs w:val="21"/>
         </w:rPr>
-        <w:t xml:space="preserve">Anotar la IP que muestra — esa es la que va en los registros DNS tipo A.</w:t>
+        <w:t xml:space="preserve">IP pública obtenida: 168.226.214.59.</w:t>
       </w:r>
     </w:p>
     <w:p>
@@ -507,7 +519,29 @@
           <w:sz w:val="19"/>
           <w:szCs w:val="19"/>
         </w:rPr>
-        <w:t xml:space="preserve">Si la conexión a internet de la oficina no tiene IP fija contratada con el proveedor, esa IP puede cambiar con el tiempo y rompería el acceso externo más adelante. Vale la pena preguntarle a Redes si la conexión tiene IP fija o si conviene contratarla / usar un servicio de DNS dinámico.</w:t>
+        <w:t xml:space="preserve">Este valor coincide con la IP que Coolify había detectado automáticamente al principio del proyecto (la del dominio sslip.io que daba timeout en las primeras pruebas). En su momento se interpretó como un error, pero en realidad es la IP pública correcta — lo que fallaba era acceder a la propia IP pública desde dentro de la misma red (limitación común de muchos routers). Para las pruebas internas se sigue usando la IP de LAN (20.0.20.138); esta IP pública (168.226.214.59) es la que corresponde usar en los registros DNS externos.</w:t>
+      </w:r>
+    </w:p>
+    <w:p>
+      <w:pPr>
+        <w:spacing w:after="100" w:line="280"/>
+      </w:pPr>
+      <w:r>
+        <w:rPr>
+          <w:b/>
+          <w:bCs/>
+          <w:color w:val="1B2A4A"/>
+          <w:sz w:val="21"/>
+          <w:szCs w:val="21"/>
+        </w:rPr>
+        <w:t xml:space="preserve">Resultado: </w:t>
+      </w:r>
+      <w:r>
+        <w:rPr>
+          <w:sz w:val="21"/>
+          <w:szCs w:val="21"/>
+        </w:rPr>
+        <w:t xml:space="preserve">IP pública confirmada — 168.226.214.59. Este es el valor a incluir en los registros DNS tipo A que se le van a pedir al Área de Redes (ver Nota Técnica para Área de Redes).</w:t>
       </w:r>
     </w:p>
     <w:p>
@@ -1549,6 +1583,18 @@
       </w:pPr>
     </w:lvl>
   </w:abstractNum>
+  <w:abstractNum w:abstractNumId="7" w15:restartNumberingAfterBreak="0">
+    <w:multiLevelType w:val="hybridMultilevel"/>
+    <w:lvl w:ilvl="0" w15:tentative="1">
+      <w:start w:val="1"/>
+      <w:numFmt w:val="decimal"/>
+      <w:lvlText w:val="%1."/>
+      <w:lvlJc w:val="left"/>
+      <w:pPr>
+        <w:ind w:left="420" w:hanging="320"/>
+      </w:pPr>
+    </w:lvl>
+  </w:abstractNum>
   <w:num w:numId="1">
     <w:abstractNumId w:val="1"/>
     <w:lvlOverride w:ilvl="0">
@@ -1568,7 +1614,7 @@
     </w:lvlOverride>
   </w:num>
   <w:num w:numId="4">
-    <w:abstractNumId w:val="3"/>
+    <w:abstractNumId w:val="7"/>
     <w:lvlOverride w:ilvl="0">
       <w:startOverride w:val="1"/>
     </w:lvlOverride>

</xml_diff>